<commit_message>
all the current pdfs and small update on PCS manager class.
</commit_message>
<xml_diff>
--- a/docs/transport/part_b_diagrams/useCaseTable.docx
+++ b/docs/transport/part_b_diagrams/useCaseTable.docx
@@ -2,318 +2,7 @@
 <file path=word/document.xml><?xml version="1.0" encoding="utf-8"?>
 <w:document xmlns:wpc="http://schemas.microsoft.com/office/word/2010/wordprocessingCanvas" xmlns:cx="http://schemas.microsoft.com/office/drawing/2014/chartex" xmlns:cx1="http://schemas.microsoft.com/office/drawing/2015/9/8/chartex" xmlns:cx2="http://schemas.microsoft.com/office/drawing/2015/10/21/chartex" xmlns:cx3="http://schemas.microsoft.com/office/drawing/2016/5/9/chartex" xmlns:cx4="http://schemas.microsoft.com/office/drawing/2016/5/10/chartex" xmlns:cx5="http://schemas.microsoft.com/office/drawing/2016/5/11/chartex" xmlns:cx6="http://schemas.microsoft.com/office/drawing/2016/5/12/chartex" xmlns:cx7="http://schemas.microsoft.com/office/drawing/2016/5/13/chartex" xmlns:cx8="http://schemas.microsoft.com/office/drawing/2016/5/14/chartex" xmlns:mc="http://schemas.openxmlformats.org/markup-compatibility/2006" xmlns:aink="http://schemas.microsoft.com/office/drawing/2016/ink" xmlns:am3d="http://schemas.microsoft.com/office/drawing/2017/model3d" xmlns:o="urn:schemas-microsoft-com:office:office" xmlns:oel="http://schemas.microsoft.com/office/2019/extlst" xmlns:r="http://schemas.openxmlformats.org/officeDocument/2006/relationships" xmlns:m="http://schemas.openxmlformats.org/officeDocument/2006/math" xmlns:v="urn:schemas-microsoft-com:vml" xmlns:wp14="http://schemas.microsoft.com/office/word/2010/wordprocessingDrawing" xmlns:wp="http://schemas.openxmlformats.org/drawingml/2006/wordprocessingDrawing" xmlns:w10="urn:schemas-microsoft-com:office:word" xmlns:w="http://schemas.openxmlformats.org/wordprocessingml/2006/main" xmlns:w14="http://schemas.microsoft.com/office/word/2010/wordml" xmlns:w15="http://schemas.microsoft.com/office/word/2012/wordml" xmlns:w16cex="http://schemas.microsoft.com/office/word/2018/wordml/cex" xmlns:w16cid="http://schemas.microsoft.com/office/word/2016/wordml/cid" xmlns:w16="http://schemas.microsoft.com/office/word/2018/wordml" xmlns:w16du="http://schemas.microsoft.com/office/word/2023/wordml/word16du" xmlns:w16sdtdh="http://schemas.microsoft.com/office/word/2020/wordml/sdtdatahash" xmlns:w16sdtfl="http://schemas.microsoft.com/office/word/2024/wordml/sdtformatlock" xmlns:w16se="http://schemas.microsoft.com/office/word/2015/wordml/symex" xmlns:wpg="http://schemas.microsoft.com/office/word/2010/wordprocessingGroup" xmlns:wpi="http://schemas.microsoft.com/office/word/2010/wordprocessingInk" xmlns:wne="http://schemas.microsoft.com/office/word/2006/wordml" xmlns:wps="http://schemas.microsoft.com/office/word/2010/wordprocessingShape" mc:Ignorable="w14 w15 w16se w16cid w16 w16cex w16sdtdh w16sdtfl w16du wp14">
   <w:body>
-    <w:tbl>
-      <w:tblPr>
-        <w:tblW w:w="10376" w:type="dxa"/>
-        <w:tblInd w:w="-560" w:type="dxa"/>
-        <w:tblLayout w:type="fixed"/>
-        <w:tblLook w:val="0400" w:firstRow="0" w:lastRow="0" w:firstColumn="0" w:lastColumn="0" w:noHBand="0" w:noVBand="1"/>
-      </w:tblPr>
-      <w:tblGrid>
-        <w:gridCol w:w="10376"/>
-      </w:tblGrid>
-      <w:tr>
-        <w:trPr>
-          <w:trHeight w:val="753"/>
-        </w:trPr>
-        <w:tc>
-          <w:tcPr>
-            <w:tcW w:w="10376" w:type="dxa"/>
-            <w:tcBorders>
-              <w:top w:val="single" w:sz="4" w:space="0" w:color="000000"/>
-              <w:left w:val="single" w:sz="4" w:space="0" w:color="000000"/>
-              <w:bottom w:val="single" w:sz="4" w:space="0" w:color="000000"/>
-              <w:right w:val="single" w:sz="4" w:space="0" w:color="000000"/>
-            </w:tcBorders>
-            <w:hideMark/>
-          </w:tcPr>
-          <w:p>
-            <w:pPr>
-              <w:rPr>
-                <w:lang w:val="en-US"/>
-              </w:rPr>
-            </w:pPr>
-            <w:r>
-              <w:rPr>
-                <w:lang w:val="en-US"/>
-              </w:rPr>
-              <w:t>Use case name</w:t>
-            </w:r>
-            <w:r>
-              <w:rPr>
-                <w:lang w:val="en-US"/>
-              </w:rPr>
-              <w:t>: Assign employee to shift</w:t>
-            </w:r>
-          </w:p>
-        </w:tc>
-      </w:tr>
-      <w:tr>
-        <w:trPr>
-          <w:trHeight w:val="758"/>
-        </w:trPr>
-        <w:tc>
-          <w:tcPr>
-            <w:tcW w:w="10376" w:type="dxa"/>
-            <w:tcBorders>
-              <w:top w:val="single" w:sz="4" w:space="0" w:color="000000"/>
-              <w:left w:val="single" w:sz="4" w:space="0" w:color="000000"/>
-              <w:bottom w:val="single" w:sz="4" w:space="0" w:color="000000"/>
-              <w:right w:val="single" w:sz="4" w:space="0" w:color="000000"/>
-            </w:tcBorders>
-            <w:hideMark/>
-          </w:tcPr>
-          <w:p>
-            <w:pPr>
-              <w:rPr>
-                <w:lang w:val="en-US"/>
-              </w:rPr>
-            </w:pPr>
-            <w:r>
-              <w:rPr>
-                <w:lang w:val="en-US"/>
-              </w:rPr>
-              <w:t>Textual Description</w:t>
-            </w:r>
-            <w:r>
-              <w:rPr>
-                <w:lang w:val="en-US"/>
-              </w:rPr>
-              <w:t xml:space="preserve">: </w:t>
-            </w:r>
-            <w:r>
-              <w:rPr>
-                <w:lang w:val="en-US"/>
-              </w:rPr>
-              <w:t>Using</w:t>
-            </w:r>
-            <w:r>
-              <w:rPr>
-                <w:lang w:val="en-US"/>
-              </w:rPr>
-              <w:t xml:space="preserve"> the manger’s input, get the shift id and employee to add , then add the employee to the desired shift</w:t>
-            </w:r>
-          </w:p>
-        </w:tc>
-      </w:tr>
-      <w:tr>
-        <w:trPr>
-          <w:trHeight w:val="753"/>
-        </w:trPr>
-        <w:tc>
-          <w:tcPr>
-            <w:tcW w:w="10376" w:type="dxa"/>
-            <w:tcBorders>
-              <w:top w:val="single" w:sz="4" w:space="0" w:color="000000"/>
-              <w:left w:val="single" w:sz="4" w:space="0" w:color="000000"/>
-              <w:bottom w:val="single" w:sz="4" w:space="0" w:color="000000"/>
-              <w:right w:val="single" w:sz="4" w:space="0" w:color="000000"/>
-            </w:tcBorders>
-            <w:hideMark/>
-          </w:tcPr>
-          <w:p>
-            <w:pPr>
-              <w:rPr>
-                <w:lang w:val="en-US"/>
-              </w:rPr>
-            </w:pPr>
-            <w:r>
-              <w:rPr>
-                <w:lang w:val="en-US"/>
-              </w:rPr>
-              <w:t>List of Actors</w:t>
-            </w:r>
-            <w:r>
-              <w:rPr>
-                <w:lang w:val="en-US"/>
-              </w:rPr>
-              <w:t xml:space="preserve">: </w:t>
-            </w:r>
-            <w:r>
-              <w:rPr>
-                <w:lang w:val="en-US"/>
-              </w:rPr>
-              <w:t>Shift Manager, Employee to assign.</w:t>
-            </w:r>
-          </w:p>
-        </w:tc>
-      </w:tr>
-      <w:tr>
-        <w:trPr>
-          <w:trHeight w:val="758"/>
-        </w:trPr>
-        <w:tc>
-          <w:tcPr>
-            <w:tcW w:w="10376" w:type="dxa"/>
-            <w:tcBorders>
-              <w:top w:val="single" w:sz="4" w:space="0" w:color="000000"/>
-              <w:left w:val="single" w:sz="4" w:space="0" w:color="000000"/>
-              <w:bottom w:val="single" w:sz="4" w:space="0" w:color="000000"/>
-              <w:right w:val="single" w:sz="4" w:space="0" w:color="000000"/>
-            </w:tcBorders>
-            <w:hideMark/>
-          </w:tcPr>
-          <w:p>
-            <w:pPr>
-              <w:rPr>
-                <w:lang w:val="en-US"/>
-              </w:rPr>
-            </w:pPr>
-            <w:r>
-              <w:rPr>
-                <w:lang w:val="en-US"/>
-              </w:rPr>
-              <w:t>Pre-conditions</w:t>
-            </w:r>
-            <w:r>
-              <w:rPr>
-                <w:lang w:val="en-US"/>
-              </w:rPr>
-              <w:t>: There exists a shift, there exists an employee</w:t>
-            </w:r>
-            <w:r>
-              <w:rPr>
-                <w:lang w:val="en-US"/>
-              </w:rPr>
-              <w:t>, the existing shift must have an attached Shift-Manager.</w:t>
-            </w:r>
-          </w:p>
-        </w:tc>
-      </w:tr>
-      <w:tr>
-        <w:trPr>
-          <w:trHeight w:val="758"/>
-        </w:trPr>
-        <w:tc>
-          <w:tcPr>
-            <w:tcW w:w="10376" w:type="dxa"/>
-            <w:tcBorders>
-              <w:top w:val="single" w:sz="4" w:space="0" w:color="000000"/>
-              <w:left w:val="single" w:sz="4" w:space="0" w:color="000000"/>
-              <w:bottom w:val="single" w:sz="4" w:space="0" w:color="000000"/>
-              <w:right w:val="single" w:sz="4" w:space="0" w:color="000000"/>
-            </w:tcBorders>
-            <w:hideMark/>
-          </w:tcPr>
-          <w:p>
-            <w:pPr>
-              <w:rPr>
-                <w:lang w:val="en-US"/>
-              </w:rPr>
-            </w:pPr>
-            <w:r>
-              <w:rPr>
-                <w:lang w:val="en-US"/>
-              </w:rPr>
-              <w:t>Post-conditions</w:t>
-            </w:r>
-            <w:r>
-              <w:rPr>
-                <w:lang w:val="en-US"/>
-              </w:rPr>
-              <w:t>: The employee gets added to the assigned employees list inside the shift.</w:t>
-            </w:r>
-          </w:p>
-        </w:tc>
-      </w:tr>
-      <w:tr>
-        <w:trPr>
-          <w:trHeight w:val="753"/>
-        </w:trPr>
-        <w:tc>
-          <w:tcPr>
-            <w:tcW w:w="10376" w:type="dxa"/>
-            <w:tcBorders>
-              <w:top w:val="single" w:sz="4" w:space="0" w:color="000000"/>
-              <w:left w:val="single" w:sz="4" w:space="0" w:color="000000"/>
-              <w:bottom w:val="single" w:sz="4" w:space="0" w:color="000000"/>
-              <w:right w:val="single" w:sz="4" w:space="0" w:color="000000"/>
-            </w:tcBorders>
-            <w:hideMark/>
-          </w:tcPr>
-          <w:p>
-            <w:pPr>
-              <w:rPr>
-                <w:lang w:val="en-US"/>
-              </w:rPr>
-            </w:pPr>
-            <w:r>
-              <w:rPr>
-                <w:lang w:val="en-US"/>
-              </w:rPr>
-              <w:t>Main success scenario</w:t>
-            </w:r>
-            <w:r>
-              <w:rPr>
-                <w:lang w:val="en-US"/>
-              </w:rPr>
-              <w:t xml:space="preserve">: </w:t>
-            </w:r>
-            <w:r>
-              <w:rPr>
-                <w:lang w:val="en-US"/>
-              </w:rPr>
-              <w:t>As discussed above.</w:t>
-            </w:r>
-          </w:p>
-        </w:tc>
-      </w:tr>
-      <w:tr>
-        <w:trPr>
-          <w:trHeight w:val="758"/>
-        </w:trPr>
-        <w:tc>
-          <w:tcPr>
-            <w:tcW w:w="10376" w:type="dxa"/>
-            <w:tcBorders>
-              <w:top w:val="single" w:sz="4" w:space="0" w:color="000000"/>
-              <w:left w:val="single" w:sz="4" w:space="0" w:color="000000"/>
-              <w:bottom w:val="single" w:sz="4" w:space="0" w:color="000000"/>
-              <w:right w:val="single" w:sz="4" w:space="0" w:color="000000"/>
-            </w:tcBorders>
-            <w:hideMark/>
-          </w:tcPr>
-          <w:p>
-            <w:pPr>
-              <w:rPr>
-                <w:lang w:val="en-US"/>
-              </w:rPr>
-            </w:pPr>
-            <w:r>
-              <w:rPr>
-                <w:lang w:val="en-US"/>
-              </w:rPr>
-              <w:t>Alternatives/Extensions</w:t>
-            </w:r>
-            <w:r>
-              <w:rPr>
-                <w:lang w:val="en-US"/>
-              </w:rPr>
-              <w:t xml:space="preserve">: </w:t>
-            </w:r>
-            <w:r>
-              <w:rPr>
-                <w:lang w:val="en-US"/>
-              </w:rPr>
-              <w:t xml:space="preserve">In case of a failure – we </w:t>
-            </w:r>
-            <w:r>
-              <w:rPr>
-                <w:lang w:val="en-US"/>
-              </w:rPr>
-              <w:t>display the specific reason for failure.</w:t>
-            </w:r>
-          </w:p>
-        </w:tc>
-      </w:tr>
-    </w:tbl>
     <w:p/>
-    <w:p/>
-    <w:p>
-      <w:r>
-        <w:br w:type="page"/>
-      </w:r>
-    </w:p>
     <w:tbl>
       <w:tblPr>
         <w:tblW w:w="10376" w:type="dxa"/>
@@ -349,20 +38,13 @@
               <w:rPr>
                 <w:lang w:val="en-US"/>
               </w:rPr>
-              <w:lastRenderedPageBreak/>
               <w:t>Use case name</w:t>
             </w:r>
             <w:r>
               <w:rPr>
                 <w:lang w:val="en-US"/>
               </w:rPr>
-              <w:t xml:space="preserve">: </w:t>
-            </w:r>
-            <w:r>
-              <w:rPr>
-                <w:lang w:val="en-US"/>
-              </w:rPr>
-              <w:t>Create a transport</w:t>
+              <w:t>: Create a transport</w:t>
             </w:r>
           </w:p>
         </w:tc>
@@ -526,7 +208,21 @@
               <w:rPr>
                 <w:lang w:val="en-US"/>
               </w:rPr>
-              <w:t>There exists a Stocker at the branch at the given delivery date-time. There exists a suitable supplier for at least part of the required items. There exists a relevant truck for the delivery at the required time. And there exists a driver for the relevant time frame with a suitable license type.</w:t>
+              <w:t xml:space="preserve">There exists a Stocker at the branch at the given delivery date-time. There exists a suitable supplier for at least part of the required items. There </w:t>
+            </w:r>
+            <w:proofErr w:type="gramStart"/>
+            <w:r>
+              <w:rPr>
+                <w:lang w:val="en-US"/>
+              </w:rPr>
+              <w:t>exists</w:t>
+            </w:r>
+            <w:proofErr w:type="gramEnd"/>
+            <w:r>
+              <w:rPr>
+                <w:lang w:val="en-US"/>
+              </w:rPr>
+              <w:t xml:space="preserve"> a relevant truck for the delivery at the required time. And there exists a driver for the relevant time frame with a suitable license type.</w:t>
             </w:r>
           </w:p>
         </w:tc>
@@ -568,7 +264,63 @@
               <w:rPr>
                 <w:lang w:val="en-US"/>
               </w:rPr>
-              <w:t>We create a transport with association to transport routes which associates to a delivery file, the transport also associates with a truck and a driver.</w:t>
+              <w:t xml:space="preserve">We create </w:t>
+            </w:r>
+            <w:proofErr w:type="gramStart"/>
+            <w:r>
+              <w:rPr>
+                <w:lang w:val="en-US"/>
+              </w:rPr>
+              <w:t>a transport</w:t>
+            </w:r>
+            <w:proofErr w:type="gramEnd"/>
+            <w:r>
+              <w:rPr>
+                <w:lang w:val="en-US"/>
+              </w:rPr>
+              <w:t xml:space="preserve"> with association to transport routes which </w:t>
+            </w:r>
+            <w:proofErr w:type="gramStart"/>
+            <w:r>
+              <w:rPr>
+                <w:lang w:val="en-US"/>
+              </w:rPr>
+              <w:t>associates</w:t>
+            </w:r>
+            <w:proofErr w:type="gramEnd"/>
+            <w:r>
+              <w:rPr>
+                <w:lang w:val="en-US"/>
+              </w:rPr>
+              <w:t xml:space="preserve"> </w:t>
+            </w:r>
+            <w:proofErr w:type="gramStart"/>
+            <w:r>
+              <w:rPr>
+                <w:lang w:val="en-US"/>
+              </w:rPr>
+              <w:t>to</w:t>
+            </w:r>
+            <w:proofErr w:type="gramEnd"/>
+            <w:r>
+              <w:rPr>
+                <w:lang w:val="en-US"/>
+              </w:rPr>
+              <w:t xml:space="preserve"> a delivery file, the transport also </w:t>
+            </w:r>
+            <w:proofErr w:type="gramStart"/>
+            <w:r>
+              <w:rPr>
+                <w:lang w:val="en-US"/>
+              </w:rPr>
+              <w:t>associates</w:t>
+            </w:r>
+            <w:proofErr w:type="gramEnd"/>
+            <w:r>
+              <w:rPr>
+                <w:lang w:val="en-US"/>
+              </w:rPr>
+              <w:t xml:space="preserve"> with a truck and a driver.</w:t>
             </w:r>
           </w:p>
         </w:tc>
@@ -733,8 +485,16 @@
               <w:rPr>
                 <w:lang w:val="en-US"/>
               </w:rPr>
-              <w:t>5. IF no truck found → FAIL</w:t>
-            </w:r>
+              <w:t xml:space="preserve">5. IF no truck </w:t>
+            </w:r>
+            <w:proofErr w:type="gramStart"/>
+            <w:r>
+              <w:rPr>
+                <w:lang w:val="en-US"/>
+              </w:rPr>
+              <w:t>found → FAIL</w:t>
+            </w:r>
+            <w:proofErr w:type="gramEnd"/>
           </w:p>
           <w:p>
             <w:pPr>
@@ -948,20 +708,42 @@
               <w:rPr>
                 <w:lang w:val="en-US"/>
               </w:rPr>
-              <w:t>10. ASSOCIATE truck and driver with the Transport</w:t>
-            </w:r>
-          </w:p>
-          <w:p>
-            <w:pPr>
-              <w:rPr>
-                <w:lang w:val="en-US"/>
-              </w:rPr>
-            </w:pPr>
-            <w:r>
-              <w:rPr>
-                <w:lang w:val="en-US"/>
-              </w:rPr>
-              <w:t>11. SAVE Transport to database</w:t>
+              <w:t xml:space="preserve">10. ASSOCIATE truck and driver with </w:t>
+            </w:r>
+            <w:proofErr w:type="gramStart"/>
+            <w:r>
+              <w:rPr>
+                <w:lang w:val="en-US"/>
+              </w:rPr>
+              <w:t>the Transport</w:t>
+            </w:r>
+            <w:proofErr w:type="gramEnd"/>
+          </w:p>
+          <w:p>
+            <w:pPr>
+              <w:rPr>
+                <w:lang w:val="en-US"/>
+              </w:rPr>
+            </w:pPr>
+            <w:r>
+              <w:rPr>
+                <w:lang w:val="en-US"/>
+              </w:rPr>
+              <w:t>11</w:t>
+            </w:r>
+            <w:proofErr w:type="gramStart"/>
+            <w:r>
+              <w:rPr>
+                <w:lang w:val="en-US"/>
+              </w:rPr>
+              <w:t>. SAVE</w:t>
+            </w:r>
+            <w:proofErr w:type="gramEnd"/>
+            <w:r>
+              <w:rPr>
+                <w:lang w:val="en-US"/>
+              </w:rPr>
+              <w:t xml:space="preserve"> Transport to database</w:t>
             </w:r>
           </w:p>
           <w:p>
@@ -1024,7 +806,6 @@
               <w:rPr>
                 <w:lang w:val="en-US"/>
               </w:rPr>
-              <w:lastRenderedPageBreak/>
               <w:t>Alternatives/Extensions</w:t>
             </w:r>
             <w:r>
@@ -1053,6 +834,7 @@
               <w:t xml:space="preserve">IF </w:t>
             </w:r>
             <w:proofErr w:type="spellStart"/>
+            <w:proofErr w:type="gramStart"/>
             <w:r>
               <w:rPr>
                 <w:lang w:val="en-US"/>
@@ -1060,6 +842,7 @@
               <w:t>suppliers.isEmpty</w:t>
             </w:r>
             <w:proofErr w:type="spellEnd"/>
+            <w:proofErr w:type="gramEnd"/>
             <w:r>
               <w:rPr>
                 <w:lang w:val="en-US"/>
@@ -1280,6 +1063,313 @@
         </w:tc>
       </w:tr>
     </w:tbl>
+    <w:p/>
+    <w:p/>
+    <w:p/>
+    <w:p/>
+    <w:p/>
+    <w:p/>
+    <w:p/>
+    <w:p/>
+    <w:p/>
+    <w:p>
+      <w:pPr>
+        <w:rPr>
+          <w:b/>
+          <w:bCs/>
+        </w:rPr>
+      </w:pPr>
+      <w:r>
+        <w:rPr>
+          <w:b/>
+          <w:bCs/>
+          <w:u w:val="single"/>
+        </w:rPr>
+        <w:lastRenderedPageBreak/>
+        <w:t>Contract:</w:t>
+      </w:r>
+      <w:r>
+        <w:rPr>
+          <w:b/>
+          <w:bCs/>
+        </w:rPr>
+        <w:br/>
+      </w:r>
+      <w:r>
+        <w:rPr>
+          <w:b/>
+          <w:bCs/>
+        </w:rPr>
+        <w:br/>
+      </w:r>
+      <w:r>
+        <w:rPr>
+          <w:b/>
+          <w:bCs/>
+        </w:rPr>
+        <w:t xml:space="preserve">Operation: </w:t>
+      </w:r>
+      <w:proofErr w:type="spellStart"/>
+      <w:proofErr w:type="gramStart"/>
+      <w:r>
+        <w:t>createTransport</w:t>
+      </w:r>
+      <w:proofErr w:type="spellEnd"/>
+      <w:r>
+        <w:t>(</w:t>
+      </w:r>
+      <w:proofErr w:type="spellStart"/>
+      <w:r>
+        <w:t>itemsList</w:t>
+      </w:r>
+      <w:proofErr w:type="spellEnd"/>
+      <w:r>
+        <w:t xml:space="preserve"> :</w:t>
+      </w:r>
+      <w:proofErr w:type="gramEnd"/>
+      <w:r>
+        <w:t xml:space="preserve"> List&lt;Item&gt;, </w:t>
+      </w:r>
+      <w:proofErr w:type="spellStart"/>
+      <w:proofErr w:type="gramStart"/>
+      <w:r>
+        <w:t>branchId</w:t>
+      </w:r>
+      <w:proofErr w:type="spellEnd"/>
+      <w:r>
+        <w:t xml:space="preserve"> :</w:t>
+      </w:r>
+      <w:proofErr w:type="gramEnd"/>
+      <w:r>
+        <w:t xml:space="preserve"> int, </w:t>
+      </w:r>
+      <w:proofErr w:type="spellStart"/>
+      <w:proofErr w:type="gramStart"/>
+      <w:r>
+        <w:t>deliveryDateTime</w:t>
+      </w:r>
+      <w:proofErr w:type="spellEnd"/>
+      <w:r>
+        <w:t xml:space="preserve"> :</w:t>
+      </w:r>
+      <w:proofErr w:type="gramEnd"/>
+      <w:r>
+        <w:t xml:space="preserve"> datetime)</w:t>
+      </w:r>
+    </w:p>
+    <w:p>
+      <w:r>
+        <w:rPr>
+          <w:b/>
+          <w:bCs/>
+        </w:rPr>
+        <w:t>References:</w:t>
+      </w:r>
+      <w:r>
+        <w:br/>
+        <w:t>Use Case: Create a Transport</w:t>
+      </w:r>
+    </w:p>
+    <w:p>
+      <w:r>
+        <w:rPr>
+          <w:b/>
+          <w:bCs/>
+        </w:rPr>
+        <w:t>Preconditions:</w:t>
+      </w:r>
+    </w:p>
+    <w:p>
+      <w:pPr>
+        <w:numPr>
+          <w:ilvl w:val="0"/>
+          <w:numId w:val="1"/>
+        </w:numPr>
+      </w:pPr>
+      <w:r>
+        <w:t xml:space="preserve">There is a Stocker available at the specified branch at </w:t>
+      </w:r>
+      <w:proofErr w:type="spellStart"/>
+      <w:r>
+        <w:t>deliveryDateTime</w:t>
+      </w:r>
+      <w:proofErr w:type="spellEnd"/>
+      <w:r>
+        <w:t>.</w:t>
+      </w:r>
+    </w:p>
+    <w:p>
+      <w:pPr>
+        <w:numPr>
+          <w:ilvl w:val="0"/>
+          <w:numId w:val="1"/>
+        </w:numPr>
+      </w:pPr>
+      <w:r>
+        <w:t>There exists at least one supplier that can supply part of the requested items.</w:t>
+      </w:r>
+    </w:p>
+    <w:p>
+      <w:pPr>
+        <w:numPr>
+          <w:ilvl w:val="0"/>
+          <w:numId w:val="1"/>
+        </w:numPr>
+      </w:pPr>
+      <w:r>
+        <w:t>There is a truck available for delivery at the required time.</w:t>
+      </w:r>
+    </w:p>
+    <w:p>
+      <w:pPr>
+        <w:numPr>
+          <w:ilvl w:val="0"/>
+          <w:numId w:val="1"/>
+        </w:numPr>
+      </w:pPr>
+      <w:r>
+        <w:t>There is a driver available during the time window with a valid license for the selected truck.</w:t>
+      </w:r>
+    </w:p>
+    <w:p>
+      <w:r>
+        <w:rPr>
+          <w:b/>
+          <w:bCs/>
+        </w:rPr>
+        <w:t>Postconditions:</w:t>
+      </w:r>
+    </w:p>
+    <w:p>
+      <w:pPr>
+        <w:numPr>
+          <w:ilvl w:val="0"/>
+          <w:numId w:val="2"/>
+        </w:numPr>
+      </w:pPr>
+      <w:r>
+        <w:t xml:space="preserve">A Transport instance was </w:t>
+      </w:r>
+      <w:r>
+        <w:rPr>
+          <w:b/>
+          <w:bCs/>
+        </w:rPr>
+        <w:t>created</w:t>
+      </w:r>
+      <w:r>
+        <w:t>.</w:t>
+      </w:r>
+    </w:p>
+    <w:p>
+      <w:pPr>
+        <w:numPr>
+          <w:ilvl w:val="0"/>
+          <w:numId w:val="2"/>
+        </w:numPr>
+      </w:pPr>
+      <w:r>
+        <w:t xml:space="preserve">The Transport was </w:t>
+      </w:r>
+      <w:r>
+        <w:rPr>
+          <w:b/>
+          <w:bCs/>
+        </w:rPr>
+        <w:t>associated</w:t>
+      </w:r>
+      <w:r>
+        <w:t xml:space="preserve"> with one or more </w:t>
+      </w:r>
+      <w:proofErr w:type="spellStart"/>
+      <w:r>
+        <w:t>TransportRoute</w:t>
+      </w:r>
+      <w:proofErr w:type="spellEnd"/>
+      <w:r>
+        <w:t xml:space="preserve"> instances.</w:t>
+      </w:r>
+    </w:p>
+    <w:p>
+      <w:pPr>
+        <w:numPr>
+          <w:ilvl w:val="0"/>
+          <w:numId w:val="2"/>
+        </w:numPr>
+      </w:pPr>
+      <w:r>
+        <w:t xml:space="preserve">Each </w:t>
+      </w:r>
+      <w:proofErr w:type="spellStart"/>
+      <w:r>
+        <w:t>TransportRoute</w:t>
+      </w:r>
+      <w:proofErr w:type="spellEnd"/>
+      <w:r>
+        <w:t xml:space="preserve"> was </w:t>
+      </w:r>
+      <w:r>
+        <w:rPr>
+          <w:b/>
+          <w:bCs/>
+        </w:rPr>
+        <w:t>associated</w:t>
+      </w:r>
+      <w:r>
+        <w:t xml:space="preserve"> with a </w:t>
+      </w:r>
+      <w:proofErr w:type="spellStart"/>
+      <w:r>
+        <w:t>DeliveryFile</w:t>
+      </w:r>
+      <w:proofErr w:type="spellEnd"/>
+      <w:r>
+        <w:t>.</w:t>
+      </w:r>
+    </w:p>
+    <w:p>
+      <w:pPr>
+        <w:numPr>
+          <w:ilvl w:val="0"/>
+          <w:numId w:val="2"/>
+        </w:numPr>
+      </w:pPr>
+      <w:r>
+        <w:t xml:space="preserve">The Transport was </w:t>
+      </w:r>
+      <w:r>
+        <w:rPr>
+          <w:b/>
+          <w:bCs/>
+        </w:rPr>
+        <w:t>associated</w:t>
+      </w:r>
+      <w:r>
+        <w:t xml:space="preserve"> with a selected Truck.</w:t>
+      </w:r>
+    </w:p>
+    <w:p>
+      <w:pPr>
+        <w:numPr>
+          <w:ilvl w:val="0"/>
+          <w:numId w:val="2"/>
+        </w:numPr>
+      </w:pPr>
+      <w:r>
+        <w:t xml:space="preserve">The Transport was </w:t>
+      </w:r>
+      <w:r>
+        <w:rPr>
+          <w:b/>
+          <w:bCs/>
+        </w:rPr>
+        <w:t>associated</w:t>
+      </w:r>
+      <w:r>
+        <w:t xml:space="preserve"> with a selected Driver.</w:t>
+      </w:r>
+    </w:p>
+    <w:p/>
     <w:p/>
     <w:sectPr>
       <w:pgSz w:w="11906" w:h="16838"/>
@@ -1289,6 +1379,315 @@
     </w:sectPr>
   </w:body>
 </w:document>
+</file>
+
+<file path=word/numbering.xml><?xml version="1.0" encoding="utf-8"?>
+<w:numbering xmlns:wpc="http://schemas.microsoft.com/office/word/2010/wordprocessingCanvas" xmlns:cx="http://schemas.microsoft.com/office/drawing/2014/chartex" xmlns:cx1="http://schemas.microsoft.com/office/drawing/2015/9/8/chartex" xmlns:cx2="http://schemas.microsoft.com/office/drawing/2015/10/21/chartex" xmlns:cx3="http://schemas.microsoft.com/office/drawing/2016/5/9/chartex" xmlns:cx4="http://schemas.microsoft.com/office/drawing/2016/5/10/chartex" xmlns:cx5="http://schemas.microsoft.com/office/drawing/2016/5/11/chartex" xmlns:cx6="http://schemas.microsoft.com/office/drawing/2016/5/12/chartex" xmlns:cx7="http://schemas.microsoft.com/office/drawing/2016/5/13/chartex" xmlns:cx8="http://schemas.microsoft.com/office/drawing/2016/5/14/chartex" xmlns:mc="http://schemas.openxmlformats.org/markup-compatibility/2006" xmlns:aink="http://schemas.microsoft.com/office/drawing/2016/ink" xmlns:am3d="http://schemas.microsoft.com/office/drawing/2017/model3d" xmlns:o="urn:schemas-microsoft-com:office:office" xmlns:oel="http://schemas.microsoft.com/office/2019/extlst" xmlns:r="http://schemas.openxmlformats.org/officeDocument/2006/relationships" xmlns:m="http://schemas.openxmlformats.org/officeDocument/2006/math" xmlns:v="urn:schemas-microsoft-com:vml" xmlns:wp14="http://schemas.microsoft.com/office/word/2010/wordprocessingDrawing" xmlns:wp="http://schemas.openxmlformats.org/drawingml/2006/wordprocessingDrawing" xmlns:w10="urn:schemas-microsoft-com:office:word" xmlns:w="http://schemas.openxmlformats.org/wordprocessingml/2006/main" xmlns:w14="http://schemas.microsoft.com/office/word/2010/wordml" xmlns:w15="http://schemas.microsoft.com/office/word/2012/wordml" xmlns:w16cex="http://schemas.microsoft.com/office/word/2018/wordml/cex" xmlns:w16cid="http://schemas.microsoft.com/office/word/2016/wordml/cid" xmlns:w16="http://schemas.microsoft.com/office/word/2018/wordml" xmlns:w16du="http://schemas.microsoft.com/office/word/2023/wordml/word16du" xmlns:w16sdtdh="http://schemas.microsoft.com/office/word/2020/wordml/sdtdatahash" xmlns:w16sdtfl="http://schemas.microsoft.com/office/word/2024/wordml/sdtformatlock" xmlns:w16se="http://schemas.microsoft.com/office/word/2015/wordml/symex" xmlns:wpg="http://schemas.microsoft.com/office/word/2010/wordprocessingGroup" xmlns:wpi="http://schemas.microsoft.com/office/word/2010/wordprocessingInk" xmlns:wne="http://schemas.microsoft.com/office/word/2006/wordml" xmlns:wps="http://schemas.microsoft.com/office/word/2010/wordprocessingShape" mc:Ignorable="w14 w15 w16se w16cid w16 w16cex w16sdtdh w16sdtfl w16du wp14">
+  <w:abstractNum w:abstractNumId="0" w15:restartNumberingAfterBreak="0">
+    <w:nsid w:val="0918203F"/>
+    <w:multiLevelType w:val="multilevel"/>
+    <w:tmpl w:val="78A4D238"/>
+    <w:lvl w:ilvl="0">
+      <w:start w:val="1"/>
+      <w:numFmt w:val="bullet"/>
+      <w:lvlText w:val=""/>
+      <w:lvlJc w:val="left"/>
+      <w:pPr>
+        <w:tabs>
+          <w:tab w:val="num" w:pos="720"/>
+        </w:tabs>
+        <w:ind w:left="720" w:hanging="360"/>
+      </w:pPr>
+      <w:rPr>
+        <w:rFonts w:ascii="Symbol" w:hAnsi="Symbol" w:hint="default"/>
+        <w:sz w:val="20"/>
+      </w:rPr>
+    </w:lvl>
+    <w:lvl w:ilvl="1" w:tentative="1">
+      <w:start w:val="1"/>
+      <w:numFmt w:val="bullet"/>
+      <w:lvlText w:val="o"/>
+      <w:lvlJc w:val="left"/>
+      <w:pPr>
+        <w:tabs>
+          <w:tab w:val="num" w:pos="1440"/>
+        </w:tabs>
+        <w:ind w:left="1440" w:hanging="360"/>
+      </w:pPr>
+      <w:rPr>
+        <w:rFonts w:ascii="Courier New" w:hAnsi="Courier New" w:hint="default"/>
+        <w:sz w:val="20"/>
+      </w:rPr>
+    </w:lvl>
+    <w:lvl w:ilvl="2" w:tentative="1">
+      <w:start w:val="1"/>
+      <w:numFmt w:val="bullet"/>
+      <w:lvlText w:val=""/>
+      <w:lvlJc w:val="left"/>
+      <w:pPr>
+        <w:tabs>
+          <w:tab w:val="num" w:pos="2160"/>
+        </w:tabs>
+        <w:ind w:left="2160" w:hanging="360"/>
+      </w:pPr>
+      <w:rPr>
+        <w:rFonts w:ascii="Wingdings" w:hAnsi="Wingdings" w:hint="default"/>
+        <w:sz w:val="20"/>
+      </w:rPr>
+    </w:lvl>
+    <w:lvl w:ilvl="3" w:tentative="1">
+      <w:start w:val="1"/>
+      <w:numFmt w:val="bullet"/>
+      <w:lvlText w:val=""/>
+      <w:lvlJc w:val="left"/>
+      <w:pPr>
+        <w:tabs>
+          <w:tab w:val="num" w:pos="2880"/>
+        </w:tabs>
+        <w:ind w:left="2880" w:hanging="360"/>
+      </w:pPr>
+      <w:rPr>
+        <w:rFonts w:ascii="Wingdings" w:hAnsi="Wingdings" w:hint="default"/>
+        <w:sz w:val="20"/>
+      </w:rPr>
+    </w:lvl>
+    <w:lvl w:ilvl="4" w:tentative="1">
+      <w:start w:val="1"/>
+      <w:numFmt w:val="bullet"/>
+      <w:lvlText w:val=""/>
+      <w:lvlJc w:val="left"/>
+      <w:pPr>
+        <w:tabs>
+          <w:tab w:val="num" w:pos="3600"/>
+        </w:tabs>
+        <w:ind w:left="3600" w:hanging="360"/>
+      </w:pPr>
+      <w:rPr>
+        <w:rFonts w:ascii="Wingdings" w:hAnsi="Wingdings" w:hint="default"/>
+        <w:sz w:val="20"/>
+      </w:rPr>
+    </w:lvl>
+    <w:lvl w:ilvl="5" w:tentative="1">
+      <w:start w:val="1"/>
+      <w:numFmt w:val="bullet"/>
+      <w:lvlText w:val=""/>
+      <w:lvlJc w:val="left"/>
+      <w:pPr>
+        <w:tabs>
+          <w:tab w:val="num" w:pos="4320"/>
+        </w:tabs>
+        <w:ind w:left="4320" w:hanging="360"/>
+      </w:pPr>
+      <w:rPr>
+        <w:rFonts w:ascii="Wingdings" w:hAnsi="Wingdings" w:hint="default"/>
+        <w:sz w:val="20"/>
+      </w:rPr>
+    </w:lvl>
+    <w:lvl w:ilvl="6" w:tentative="1">
+      <w:start w:val="1"/>
+      <w:numFmt w:val="bullet"/>
+      <w:lvlText w:val=""/>
+      <w:lvlJc w:val="left"/>
+      <w:pPr>
+        <w:tabs>
+          <w:tab w:val="num" w:pos="5040"/>
+        </w:tabs>
+        <w:ind w:left="5040" w:hanging="360"/>
+      </w:pPr>
+      <w:rPr>
+        <w:rFonts w:ascii="Wingdings" w:hAnsi="Wingdings" w:hint="default"/>
+        <w:sz w:val="20"/>
+      </w:rPr>
+    </w:lvl>
+    <w:lvl w:ilvl="7" w:tentative="1">
+      <w:start w:val="1"/>
+      <w:numFmt w:val="bullet"/>
+      <w:lvlText w:val=""/>
+      <w:lvlJc w:val="left"/>
+      <w:pPr>
+        <w:tabs>
+          <w:tab w:val="num" w:pos="5760"/>
+        </w:tabs>
+        <w:ind w:left="5760" w:hanging="360"/>
+      </w:pPr>
+      <w:rPr>
+        <w:rFonts w:ascii="Wingdings" w:hAnsi="Wingdings" w:hint="default"/>
+        <w:sz w:val="20"/>
+      </w:rPr>
+    </w:lvl>
+    <w:lvl w:ilvl="8" w:tentative="1">
+      <w:start w:val="1"/>
+      <w:numFmt w:val="bullet"/>
+      <w:lvlText w:val=""/>
+      <w:lvlJc w:val="left"/>
+      <w:pPr>
+        <w:tabs>
+          <w:tab w:val="num" w:pos="6480"/>
+        </w:tabs>
+        <w:ind w:left="6480" w:hanging="360"/>
+      </w:pPr>
+      <w:rPr>
+        <w:rFonts w:ascii="Wingdings" w:hAnsi="Wingdings" w:hint="default"/>
+        <w:sz w:val="20"/>
+      </w:rPr>
+    </w:lvl>
+  </w:abstractNum>
+  <w:abstractNum w:abstractNumId="1" w15:restartNumberingAfterBreak="0">
+    <w:nsid w:val="4A60032E"/>
+    <w:multiLevelType w:val="multilevel"/>
+    <w:tmpl w:val="61AC8C96"/>
+    <w:lvl w:ilvl="0">
+      <w:start w:val="1"/>
+      <w:numFmt w:val="bullet"/>
+      <w:lvlText w:val=""/>
+      <w:lvlJc w:val="left"/>
+      <w:pPr>
+        <w:tabs>
+          <w:tab w:val="num" w:pos="720"/>
+        </w:tabs>
+        <w:ind w:left="720" w:hanging="360"/>
+      </w:pPr>
+      <w:rPr>
+        <w:rFonts w:ascii="Symbol" w:hAnsi="Symbol" w:hint="default"/>
+        <w:sz w:val="20"/>
+      </w:rPr>
+    </w:lvl>
+    <w:lvl w:ilvl="1" w:tentative="1">
+      <w:start w:val="1"/>
+      <w:numFmt w:val="bullet"/>
+      <w:lvlText w:val="o"/>
+      <w:lvlJc w:val="left"/>
+      <w:pPr>
+        <w:tabs>
+          <w:tab w:val="num" w:pos="1440"/>
+        </w:tabs>
+        <w:ind w:left="1440" w:hanging="360"/>
+      </w:pPr>
+      <w:rPr>
+        <w:rFonts w:ascii="Courier New" w:hAnsi="Courier New" w:hint="default"/>
+        <w:sz w:val="20"/>
+      </w:rPr>
+    </w:lvl>
+    <w:lvl w:ilvl="2" w:tentative="1">
+      <w:start w:val="1"/>
+      <w:numFmt w:val="bullet"/>
+      <w:lvlText w:val=""/>
+      <w:lvlJc w:val="left"/>
+      <w:pPr>
+        <w:tabs>
+          <w:tab w:val="num" w:pos="2160"/>
+        </w:tabs>
+        <w:ind w:left="2160" w:hanging="360"/>
+      </w:pPr>
+      <w:rPr>
+        <w:rFonts w:ascii="Wingdings" w:hAnsi="Wingdings" w:hint="default"/>
+        <w:sz w:val="20"/>
+      </w:rPr>
+    </w:lvl>
+    <w:lvl w:ilvl="3" w:tentative="1">
+      <w:start w:val="1"/>
+      <w:numFmt w:val="bullet"/>
+      <w:lvlText w:val=""/>
+      <w:lvlJc w:val="left"/>
+      <w:pPr>
+        <w:tabs>
+          <w:tab w:val="num" w:pos="2880"/>
+        </w:tabs>
+        <w:ind w:left="2880" w:hanging="360"/>
+      </w:pPr>
+      <w:rPr>
+        <w:rFonts w:ascii="Wingdings" w:hAnsi="Wingdings" w:hint="default"/>
+        <w:sz w:val="20"/>
+      </w:rPr>
+    </w:lvl>
+    <w:lvl w:ilvl="4" w:tentative="1">
+      <w:start w:val="1"/>
+      <w:numFmt w:val="bullet"/>
+      <w:lvlText w:val=""/>
+      <w:lvlJc w:val="left"/>
+      <w:pPr>
+        <w:tabs>
+          <w:tab w:val="num" w:pos="3600"/>
+        </w:tabs>
+        <w:ind w:left="3600" w:hanging="360"/>
+      </w:pPr>
+      <w:rPr>
+        <w:rFonts w:ascii="Wingdings" w:hAnsi="Wingdings" w:hint="default"/>
+        <w:sz w:val="20"/>
+      </w:rPr>
+    </w:lvl>
+    <w:lvl w:ilvl="5" w:tentative="1">
+      <w:start w:val="1"/>
+      <w:numFmt w:val="bullet"/>
+      <w:lvlText w:val=""/>
+      <w:lvlJc w:val="left"/>
+      <w:pPr>
+        <w:tabs>
+          <w:tab w:val="num" w:pos="4320"/>
+        </w:tabs>
+        <w:ind w:left="4320" w:hanging="360"/>
+      </w:pPr>
+      <w:rPr>
+        <w:rFonts w:ascii="Wingdings" w:hAnsi="Wingdings" w:hint="default"/>
+        <w:sz w:val="20"/>
+      </w:rPr>
+    </w:lvl>
+    <w:lvl w:ilvl="6" w:tentative="1">
+      <w:start w:val="1"/>
+      <w:numFmt w:val="bullet"/>
+      <w:lvlText w:val=""/>
+      <w:lvlJc w:val="left"/>
+      <w:pPr>
+        <w:tabs>
+          <w:tab w:val="num" w:pos="5040"/>
+        </w:tabs>
+        <w:ind w:left="5040" w:hanging="360"/>
+      </w:pPr>
+      <w:rPr>
+        <w:rFonts w:ascii="Wingdings" w:hAnsi="Wingdings" w:hint="default"/>
+        <w:sz w:val="20"/>
+      </w:rPr>
+    </w:lvl>
+    <w:lvl w:ilvl="7" w:tentative="1">
+      <w:start w:val="1"/>
+      <w:numFmt w:val="bullet"/>
+      <w:lvlText w:val=""/>
+      <w:lvlJc w:val="left"/>
+      <w:pPr>
+        <w:tabs>
+          <w:tab w:val="num" w:pos="5760"/>
+        </w:tabs>
+        <w:ind w:left="5760" w:hanging="360"/>
+      </w:pPr>
+      <w:rPr>
+        <w:rFonts w:ascii="Wingdings" w:hAnsi="Wingdings" w:hint="default"/>
+        <w:sz w:val="20"/>
+      </w:rPr>
+    </w:lvl>
+    <w:lvl w:ilvl="8" w:tentative="1">
+      <w:start w:val="1"/>
+      <w:numFmt w:val="bullet"/>
+      <w:lvlText w:val=""/>
+      <w:lvlJc w:val="left"/>
+      <w:pPr>
+        <w:tabs>
+          <w:tab w:val="num" w:pos="6480"/>
+        </w:tabs>
+        <w:ind w:left="6480" w:hanging="360"/>
+      </w:pPr>
+      <w:rPr>
+        <w:rFonts w:ascii="Wingdings" w:hAnsi="Wingdings" w:hint="default"/>
+        <w:sz w:val="20"/>
+      </w:rPr>
+    </w:lvl>
+  </w:abstractNum>
+  <w:num w:numId="1" w16cid:durableId="658115302">
+    <w:abstractNumId w:val="0"/>
+  </w:num>
+  <w:num w:numId="2" w16cid:durableId="1888490050">
+    <w:abstractNumId w:val="1"/>
+  </w:num>
+</w:numbering>
 </file>
 
 <file path=word/styles.xml><?xml version="1.0" encoding="utf-8"?>
@@ -1894,6 +2293,7 @@
   <w:style w:type="character" w:default="1" w:styleId="DefaultParagraphFont">
     <w:name w:val="Default Paragraph Font"/>
     <w:uiPriority w:val="1"/>
+    <w:semiHidden/>
     <w:unhideWhenUsed/>
   </w:style>
   <w:style w:type="table" w:default="1" w:styleId="TableNormal">

</xml_diff>